<commit_message>
Rework footer: pulse availability dot, larger copywrite, copyright above back-to-top; refresh CV; add Claude Code skills and hooks
</commit_message>
<xml_diff>
--- a/docs/cv_abraham_sandoval.docx
+++ b/docs/cv_abraham_sandoval.docx
@@ -17,14 +17,14 @@
         <w:tblLook w:val="0000" w:firstRow="0" w:noVBand="0" w:lastRow="0" w:firstColumn="0" w:lastColumn="0" w:noHBand="0"/>
       </w:tblPr>
       <w:tblGrid>
-        <w:gridCol w:w="3597"/>
-        <w:gridCol w:w="7473"/>
+        <w:gridCol w:w="3596"/>
+        <w:gridCol w:w="7474"/>
       </w:tblGrid>
       <w:tr>
         <w:trPr/>
         <w:tc>
           <w:tcPr>
-            <w:tcW w:w="3597" w:type="dxa"/>
+            <w:tcW w:w="3596" w:type="dxa"/>
             <w:tcBorders/>
             <w:shd w:color="auto" w:fill="0F172A" w:val="clear"/>
           </w:tcPr>
@@ -170,8 +170,6 @@
                 <w:szCs w:val="18"/>
               </w:rPr>
               <w:t>Mobile phone: 6623 99 96 27</w:t>
-              <w:br/>
-              <w:t>WhatsApp: 6624 44 10 38</w:t>
             </w:r>
           </w:p>
           <w:p>
@@ -540,17 +538,7 @@
                 <w:caps/>
                 <w:color w:val="38BDF8"/>
               </w:rPr>
-              <w:t>AI-Assisted Dev</w:t>
-            </w:r>
-            <w:r>
-              <w:rPr>
-                <w:rFonts w:eastAsia="Arial" w:cs="Arial" w:ascii="Arial" w:hAnsi="Arial"/>
-                <w:b/>
-                <w:bCs/>
-                <w:caps/>
-                <w:color w:val="38BDF8"/>
-              </w:rPr>
-              <w:t>ELOPMENT</w:t>
+              <w:t>AI-Assisted DevELOPMENT</w:t>
             </w:r>
           </w:p>
           <w:p>
@@ -747,7 +735,7 @@
         </w:tc>
         <w:tc>
           <w:tcPr>
-            <w:tcW w:w="7473" w:type="dxa"/>
+            <w:tcW w:w="7474" w:type="dxa"/>
             <w:tcBorders/>
             <w:shd w:color="auto" w:fill="FFFFFF" w:themeFill="background1" w:val="clear"/>
             <w:tcMar>
@@ -2688,8 +2676,8 @@
       <w:u w:val="single"/>
     </w:rPr>
   </w:style>
-  <w:style w:type="character" w:styleId="FootnoteCharacters">
-    <w:name w:val="Footnote Characters"/>
+  <w:style w:type="character" w:styleId="FootnoteCharactersuser">
+    <w:name w:val="Footnote Characters (user)"/>
     <w:uiPriority w:val="99"/>
     <w:semiHidden/>
     <w:unhideWhenUsed/>
@@ -2698,8 +2686,8 @@
       <w:vertAlign w:val="superscript"/>
     </w:rPr>
   </w:style>
-  <w:style w:type="character" w:styleId="FootnoteCharactersuser">
-    <w:name w:val="Footnote Characters (user)"/>
+  <w:style w:type="character" w:styleId="FootnoteCharacters">
+    <w:name w:val="Footnote Characters"/>
     <w:qFormat/>
     <w:rPr>
       <w:vertAlign w:val="superscript"/>
@@ -2723,8 +2711,8 @@
       <w:szCs w:val="20"/>
     </w:rPr>
   </w:style>
-  <w:style w:type="character" w:styleId="EndnoteCharacters">
-    <w:name w:val="Endnote Characters"/>
+  <w:style w:type="character" w:styleId="EndnoteCharactersuser">
+    <w:name w:val="Endnote Characters (user)"/>
     <w:uiPriority w:val="99"/>
     <w:semiHidden/>
     <w:unhideWhenUsed/>
@@ -2733,8 +2721,8 @@
       <w:vertAlign w:val="superscript"/>
     </w:rPr>
   </w:style>
-  <w:style w:type="character" w:styleId="EndnoteCharactersuser">
-    <w:name w:val="Endnote Characters (user)"/>
+  <w:style w:type="character" w:styleId="EndnoteCharacters">
+    <w:name w:val="Endnote Characters"/>
     <w:qFormat/>
     <w:rPr>
       <w:vertAlign w:val="superscript"/>
@@ -2758,8 +2746,8 @@
       <w:szCs w:val="20"/>
     </w:rPr>
   </w:style>
-  <w:style w:type="character" w:styleId="Bulletsuser">
-    <w:name w:val="Bullets (user)"/>
+  <w:style w:type="character" w:styleId="Bullets">
+    <w:name w:val="Bullets"/>
     <w:qFormat/>
     <w:rPr>
       <w:rFonts w:ascii="OpenSymbol" w:hAnsi="OpenSymbol" w:eastAsia="OpenSymbol" w:cs="OpenSymbol"/>

</xml_diff>